<commit_message>
Remove Equans logo and refresh docs visuals.
Delete the Equans logo asset, replace it with a neutral SI mark, scrub the Word guide media, and regenerate dashboard screenshots without Equans branding.
</commit_message>
<xml_diff>
--- a/docs/Guide_PowerBI_ServiceNow_Salesforce_BAHJI.docx
+++ b/docs/Guide_PowerBI_ServiceNow_Salesforce_BAHJI.docx
@@ -47,7 +47,7 @@
           <w:i/>
           <w:sz w:val="24"/>
         </w:rPr>
-        <w:t>Connexion ServiceNow + Salesforce — Hotline team / N2 / N3</w:t>
+        <w:t>Connexion ServiceNow + Salesforce — Helpdesk / N2 / N3</w:t>
       </w:r>
     </w:p>
     <w:p>
@@ -95,7 +95,7 @@
           <w:i w:val="0"/>
           <w:sz w:val="24"/>
         </w:rPr>
-        <w:t>Le tableau de bord de pilotage du SI ne doit pas rester un exercice théorique. Pour Direction des Systèmes d'Information, l'exigence managériale est de le matérialiser dans Power BI, alimenté par les outils de ticketing réellement utilisés : ServiceNow (socle ITSM Hotline / N2 / N3) et Salesforce (cases / CRM &amp; support applicatif). Cette section décrit l'architecture, le modèle de données, les connexions, les mesures DAX et le plan de déploiement — éléments directement intégrables à la Partie 3 du mémoire.</w:t>
+        <w:t>Le tableau de bord de pilotage du SI ne doit pas rester un exercice théorique. Pour Direction des Systèmes d'Information, l'exigence managériale est de le matérialiser dans Power BI, alimenté par les outils de ticketing réellement utilisés : ServiceNow (socle ITSM Helpdesk / N2 / N3) et Salesforce (cases / CRM &amp; support applicatif). Cette section décrit l'architecture, le modèle de données, les connexions, les mesures DAX et le plan de déploiement — éléments directement intégrables à la Partie 3 du mémoire.</w:t>
       </w:r>
     </w:p>
     <w:p>
@@ -275,7 +275,7 @@
           <w:i w:val="0"/>
           <w:sz w:val="24"/>
         </w:rPr>
-        <w:t>Mapper assignment_group → Hotline team / N2 / N3 via table de correspondance.</w:t>
+        <w:t>Mapper assignment_group → Helpdesk / N2 / N3 via table de correspondance.</w:t>
       </w:r>
     </w:p>
     <w:p>
@@ -351,7 +351,7 @@
           <w:i w:val="0"/>
           <w:sz w:val="24"/>
         </w:rPr>
-        <w:t>Idéal : champ custom Support_Tier__c (Hotline / N2 / N3) alimenté par Flow / Omni-Channel.</w:t>
+        <w:t>Idéal : champ custom Support_Tier__c (Helpdesk / N2 / N3) alimenté par Flow / Omni-Channel.</w:t>
       </w:r>
     </w:p>
     <w:p>
@@ -653,7 +653,7 @@
                 <w:i w:val="0"/>
                 <w:sz w:val="16"/>
               </w:rPr>
-              <w:t>Hotline / N2 / N3</w:t>
+              <w:t>Helpdesk / N2 / N3</w:t>
             </w:r>
           </w:p>
         </w:tc>
@@ -937,7 +937,7 @@
           <w:i w:val="0"/>
           <w:sz w:val="24"/>
         </w:rPr>
-        <w:t>Le fait central Fact_Tickets_Unified contient un ticket par ligne, avec les flags EscalatedToN2 et EscalatedToN3 indispensables au calcul des taux d'escalade Hotline→N2 et N2→N3. Les dimensions permettent les analyses croisées (priorité, application, source, calendrier, niveau).</w:t>
+        <w:t>Le fait central Fact_Tickets_Unified contient un ticket par ligne, avec les flags EscalatedToN2 et EscalatedToN3 indispensables au calcul des taux d'escalade Helpdesk→N2 et N2→N3. Les dimensions permettent les analyses croisées (priorité, application, source, calendrier, niveau).</w:t>
       </w:r>
     </w:p>
     <w:p>
@@ -1056,7 +1056,7 @@
                 <w:i w:val="0"/>
                 <w:sz w:val="16"/>
               </w:rPr>
-              <w:t>Escalade Hotline vers N2 %</w:t>
+              <w:t>Escalade Helpdesk vers N2 %</w:t>
             </w:r>
           </w:p>
         </w:tc>
@@ -1076,7 +1076,7 @@
                 <w:i w:val="0"/>
                 <w:sz w:val="16"/>
               </w:rPr>
-              <w:t>Tickets escaladés N2 / Tickets Hotline</w:t>
+              <w:t>Tickets escaladés N2 / Tickets Helpdesk</w:t>
             </w:r>
           </w:p>
         </w:tc>
@@ -1246,7 +1246,7 @@
                 <w:i w:val="0"/>
                 <w:sz w:val="16"/>
               </w:rPr>
-              <w:t>Taux Resolution Hotline %</w:t>
+              <w:t>Taux Resolution Helpdesk %</w:t>
             </w:r>
           </w:p>
         </w:tc>
@@ -1267,7 +1267,7 @@
                 <w:i w:val="0"/>
                 <w:sz w:val="16"/>
               </w:rPr>
-              <w:t>Clos au Hotline / Tickets Hotline</w:t>
+              <w:t>Clos au Helpdesk / Tickets Helpdesk</w:t>
             </w:r>
           </w:p>
         </w:tc>
@@ -1528,7 +1528,7 @@
           <w:i w:val="0"/>
           <w:sz w:val="24"/>
         </w:rPr>
-        <w:t>Page 1 — Executive Pilotage SI : volume, SLA global, escalade Hotline→N2, escalade N2→N3, CSAT.</w:t>
+        <w:t>Page 1 — Executive Pilotage SI : volume, SLA global, escalade Helpdesk→N2, escalade N2→N3, CSAT.</w:t>
       </w:r>
     </w:p>
     <w:p>
@@ -1543,7 +1543,7 @@
           <w:i w:val="0"/>
           <w:sz w:val="24"/>
         </w:rPr>
-        <w:t>Page 2 — Hotline team : files, SLA 1ère réponse, taux résolution, top catégories, mauvaise qualification.</w:t>
+        <w:t>Page 2 — Helpdesk : files, SLA 1ère réponse, taux résolution, top catégories, mauvaise qualification.</w:t>
       </w:r>
     </w:p>
     <w:p>
@@ -1771,7 +1771,7 @@
                 <w:i w:val="0"/>
                 <w:sz w:val="16"/>
               </w:rPr>
-              <w:t>Accès SN/SF, mapping groupes Hotline/N2/N3, RLS</w:t>
+              <w:t>Accès SN/SF, mapping groupes Helpdesk/N2/N3, RLS</w:t>
             </w:r>
           </w:p>
         </w:tc>
@@ -2331,7 +2331,7 @@
           <w:i w:val="0"/>
           <w:sz w:val="24"/>
         </w:rPr>
-        <w:t>Cette mise en œuvre Power BI démontre la capacité à passer du diagnostic à un outil de pilotage actionnable. Elle opérationnalise les hypothèses du mémoire : gouvernance par indicateurs, objectivation des escalades Hotline→N2 et N2→N3, et alignement support / stratégie via un dashboard unique alimenté par les systèmes de production Pilotage SI.</w:t>
+        <w:t>Cette mise en œuvre Power BI démontre la capacité à passer du diagnostic à un outil de pilotage actionnable. Elle opérationnalise les hypothèses du mémoire : gouvernance par indicateurs, objectivation des escalades Helpdesk→N2 et N2→N3, et alignement support / stratégie via un dashboard unique alimenté par les systèmes de production Pilotage SI.</w:t>
       </w:r>
     </w:p>
     <w:p>
@@ -2348,7 +2348,7 @@
           <w:sz w:val="18"/>
         </w:rPr>
         <w:br/>
-        <w:t>— Kit Power BI Pilotage SI — ServiceNow + Salesforce — Hotline team / N2 / N3 — BAHJI Mohammed —</w:t>
+        <w:t>— Kit Power BI Pilotage SI — ServiceNow + Salesforce — Helpdesk / N2 / N3 — BAHJI Mohammed —</w:t>
       </w:r>
     </w:p>
     <w:sectPr>

</xml_diff>